<commit_message>
Record the 21 October instructor demonstration in the Sprint 1 report
The running build was demonstrated on the deployed Azure environment on
21 October and the instructor confirmed the demonstrated scope, so the
cloud demo is no longer an open Sprint 2 item. The report records it as a
dated stakeholder event, closes the matching Sprint 0 improvement action,
and keeps the scope-baseline acknowledgement open because the
confirmation was verbal. The deck's milestone table and Sprint 2 list
follow the same correction.

Co-Authored-By: Claude Opus 5 <noreply@anthropic.com>
</commit_message>
<xml_diff>
--- a/project-plan/StatusReports2/DealerOps Status Report 2 - Sprint 1 - Group 2.docx
+++ b/project-plan/StatusReports2/DealerOps Status Report 2 - Sprint 1 - Group 2.docx
@@ -940,7 +940,7 @@
                 <w:b w:val="0"/>
                 <w:sz w:val="19"/>
               </w:rPr>
-              <w:t>Delivered ahead of plan: the complete delivery-extension set in design/21 §9 (DMS-18, PAY-01–05, SALE-01, DASH-01, CRM-16, WO-08, AD-14, SHOP-01–05, AUD-10–17, manager/staff roles); the seven reopened requirements; the ten-defect browser fix cycle; and a full Azure apply with a local-to-cloud database seed, which was a Sprint 2 item.</w:t>
+              <w:t>Delivered ahead of plan: the complete delivery-extension set in design/21 §9 (DMS-18, PAY-01–05, SALE-01, DASH-01, CRM-16, WO-08, AD-14, SHOP-01–05, AUD-10–17, manager/staff roles); the seven reopened requirements; the ten-defect browser fix cycle; a full Azure apply with a local-to-cloud database seed; and the instructor demonstration of the running build on that deployed environment on 21 October. The last two were Sprint 2 items.</w:t>
             </w:r>
           </w:p>
           <w:p>
@@ -1141,6 +1141,18 @@
               <w:t>The client-facing system design briefing gives stakeholders a single current view of the architecture without reading the design folder.</w:t>
             </w:r>
           </w:p>
+          <w:p>
+            <w:pPr>
+              <w:spacing w:after="40" w:before="0"/>
+            </w:pPr>
+            <w:r>
+              <w:rPr>
+                <w:b w:val="0"/>
+                <w:sz w:val="19"/>
+              </w:rPr>
+              <w:t>The build ran on the deployed Azure environment in front of the instructor on 21 October and the demonstrated scope was confirmed, so the cloud path is proven rather than assumed.</w:t>
+            </w:r>
+          </w:p>
         </w:tc>
       </w:tr>
       <w:tr>
@@ -1249,7 +1261,7 @@
                 <w:b w:val="0"/>
                 <w:sz w:val="19"/>
               </w:rPr>
-              <w:t>6. Rehearse the live demo on the deployed Azure environment before the class demo, using the two-dealership data set. Owner: Yuandong and Logan.</w:t>
+              <w:t>6. Obtain a written instructor acknowledgement of the scope baseline and the NN-05 hosting decision, and collect the student IDs. The demonstration of 21 October produced a verbal confirmation only. Owner: Yuandong. Due: 31 October.</w:t>
             </w:r>
           </w:p>
           <w:p>
@@ -1261,19 +1273,7 @@
                 <w:b w:val="0"/>
                 <w:sz w:val="19"/>
               </w:rPr>
-              <w:t>7. Obtain the instructor’s decision on the scope baseline and NN-05, and collect the student IDs. Owner: Yuandong. Due: 31 October.</w:t>
-            </w:r>
-          </w:p>
-          <w:p>
-            <w:pPr>
-              <w:spacing w:after="40" w:before="0"/>
-            </w:pPr>
-            <w:r>
-              <w:rPr>
-                <w:b w:val="0"/>
-                <w:sz w:val="19"/>
-              </w:rPr>
-              <w:t>8. Refresh project-plan/Implementation-Delivery-Status.md, which still carries the 12 October status date, at sprint close. Owner: Yuandong. Due: 1 November.</w:t>
+              <w:t>7. Update project-plan/Implementation-Delivery-Status.md again at sprint close so it carries the final Sprint 1 outcome. Owner: Yuandong. Due: 1 November.</w:t>
             </w:r>
           </w:p>
         </w:tc>
@@ -1499,7 +1499,7 @@
                 <w:b w:val="0"/>
                 <w:sz w:val="19"/>
               </w:rPr>
-              <w:t>Open — carried to Sprint 2 as action 7</w:t>
+              <w:t>Open — carried to Sprint 2 as action 6</w:t>
             </w:r>
           </w:p>
         </w:tc>
@@ -1705,7 +1705,7 @@
                 <w:b w:val="0"/>
                 <w:sz w:val="19"/>
               </w:rPr>
-              <w:t>The infrastructure is ready: one-command apply, a local-to-Azure database seed with automatic backup, and verification through the Gateway. The demo itself has not been rehearsed on the deployed environment.</w:t>
+              <w:t>Done. The running build was demonstrated to the instructor on the deployed Azure environment on 21 October, and the instructor confirmed the demonstrated scope. The one-command apply, the local-to-Azure database seed with an automatic backup, and verification through the Gateway were all in place for it.</w:t>
             </w:r>
           </w:p>
         </w:tc>
@@ -1723,7 +1723,7 @@
                 <w:b w:val="0"/>
                 <w:sz w:val="19"/>
               </w:rPr>
-              <w:t>Partly done — carried to Sprint 2 as action 6</w:t>
+              <w:t>Done</w:t>
             </w:r>
           </w:p>
         </w:tc>
@@ -2128,6 +2128,80 @@
                 <w:sz w:val="19"/>
               </w:rPr>
               <w:t>All ten fixed and re-checked the same day; the end-to-end suite was re-run (309 passed, 3 skipped).</w:t>
+            </w:r>
+          </w:p>
+        </w:tc>
+      </w:tr>
+      <w:tr>
+        <w:tc>
+          <w:tcPr>
+            <w:tcW w:type="dxa" w:w="1224"/>
+          </w:tcPr>
+          <w:p>
+            <w:pPr>
+              <w:spacing w:after="40" w:before="40"/>
+            </w:pPr>
+            <w:r/>
+            <w:r>
+              <w:rPr>
+                <w:b w:val="0"/>
+                <w:sz w:val="19"/>
+              </w:rPr>
+              <w:t>21 Oct 2026</w:t>
+            </w:r>
+          </w:p>
+        </w:tc>
+        <w:tc>
+          <w:tcPr>
+            <w:tcW w:type="dxa" w:w="2160"/>
+          </w:tcPr>
+          <w:p>
+            <w:pPr>
+              <w:spacing w:after="40" w:before="40"/>
+            </w:pPr>
+            <w:r/>
+            <w:r>
+              <w:rPr>
+                <w:b w:val="0"/>
+                <w:sz w:val="19"/>
+              </w:rPr>
+              <w:t>Instructor demonstration</w:t>
+            </w:r>
+          </w:p>
+        </w:tc>
+        <w:tc>
+          <w:tcPr>
+            <w:tcW w:type="dxa" w:w="3456"/>
+          </w:tcPr>
+          <w:p>
+            <w:pPr>
+              <w:spacing w:after="40" w:before="40"/>
+            </w:pPr>
+            <w:r/>
+            <w:r>
+              <w:rPr>
+                <w:b w:val="0"/>
+                <w:sz w:val="19"/>
+              </w:rPr>
+              <w:t>The running build was demonstrated on the deployed Azure environment.</w:t>
+            </w:r>
+          </w:p>
+        </w:tc>
+        <w:tc>
+          <w:tcPr>
+            <w:tcW w:type="dxa" w:w="3240"/>
+          </w:tcPr>
+          <w:p>
+            <w:pPr>
+              <w:spacing w:after="40" w:before="40"/>
+            </w:pPr>
+            <w:r/>
+            <w:r>
+              <w:rPr>
+                <w:b w:val="0"/>
+                <w:sz w:val="19"/>
+              </w:rPr>
+              <w:t>The instructor confirmed the demonstrated scope. The confirmation was verbal at the demonstration; no written sign-off was issued, so the scope-baseline acknowledgement in section 2 stays open.</w:t>
             </w:r>
           </w:p>
         </w:tc>
@@ -3635,7 +3709,7 @@
           <w:i w:val="0"/>
           <w:sz w:val="19"/>
         </w:rPr>
-        <w:t>Demo coverage against the 50% minimum. Feature development is complete, so the demo shows a finished build rather than a partial prototype. All core modules of the proposed system are implemented and can be shown running: platform administration and two-dealership tenancy, DMS with the eight specified vehicle fields and the sale flow, CRM with customer-to-vehicle links, the OMVIC ad checklist with a real AI review and gated TXT export, the read-only in-store assistant, audit history, and the delivery extensions (payments, bill of sale, dashboard, reports, buyer site, manager and staff roles). Coverage is therefore well above the 50% minimum; the gap is acceptance evidence, not functionality.</w:t>
+        <w:t>Demo coverage against the 50% minimum. Feature development is complete, so the demo shows a finished build rather than a partial prototype, and it has already been run once on the deployed Azure environment in front of the instructor, on 21 October. All core modules of the proposed system are implemented and can be shown running: platform administration and two-dealership tenancy, DMS with the eight specified vehicle fields and the sale flow, CRM with customer-to-vehicle links, the OMVIC ad checklist with a real AI review and gated TXT export, the read-only in-store assistant, audit history, and the delivery extensions (payments, bill of sale, dashboard, reports, buyer site, manager and staff roles). Coverage is therefore well above the 50% minimum; the gap is acceptance evidence, not functionality.</w:t>
       </w:r>
     </w:p>
     <w:p>
@@ -3939,7 +4013,7 @@
                 <w:b w:val="0"/>
                 <w:sz w:val="19"/>
               </w:rPr>
-              <w:t>Build the Status Report 2 presentation deck (progress, architectural updates, milestone tracking) and rehearse the live demo on the deployed Azure environment.</w:t>
+              <w:t>Rehearse the Status Report 2 presentation with the deck prepared on 23 October. The build itself was already demonstrated on the deployed environment on 21 October.</w:t>
             </w:r>
           </w:p>
         </w:tc>
@@ -3995,7 +4069,7 @@
                 <w:b w:val="0"/>
                 <w:sz w:val="19"/>
               </w:rPr>
-              <w:t>Publish the Research Log and AI Log on the team site; collect the student IDs; request the instructor decision on the scope baseline and NN-05.</w:t>
+              <w:t>Publish the Research Log and AI Log on the team site; collect the student IDs; ask the instructor to record the scope-baseline and NN-05 acknowledgement in writing.</w:t>
             </w:r>
           </w:p>
         </w:tc>
@@ -4366,7 +4440,7 @@
                 <w:b w:val="0"/>
                 <w:sz w:val="19"/>
               </w:rPr>
-              <w:t>Section 3 records each dated piece of feedback and the action it produced: the client requirement review of 19 October, the client scope request of 21 October and the internal browser review of 20 October. The sprint review of 1 November is recorded in the same table before submission.</w:t>
+              <w:t>Section 3 records each dated piece of feedback and the action it produced: the client requirement review of 19 October, the internal browser review of 20 October, the client scope request and the instructor demonstration of 21 October. The sprint review of 1 November is recorded in the same table before submission.</w:t>
             </w:r>
           </w:p>
         </w:tc>

</xml_diff>